<commit_message>
docs(calls): update guide for selective resolve
</commit_message>
<xml_diff>
--- a/docs/mango_calls_handoff_20260816/MANGO_CALLS_QUALITY_V3_EXECUTIVE_GUIDE_2026-08-17.docx
+++ b/docs/mango_calls_handoff_20260816/MANGO_CALLS_QUALITY_V3_EXECUTIVE_GUIDE_2026-08-17.docx
@@ -37,7 +37,7 @@
         <w:widowControl/>
       </w:pPr>
       <w:r>
-        <w:t xml:space="preserve">17 августа 2026 года</w:t>
+        <w:t>18 августа 2026 года</w:t>
       </w:r>
     </w:p>
     <w:sdt>
@@ -83,6 +83,7 @@
         <w:trPr>
           <w:tblHeader w:val="on"/>
           <w:tblHeader w:val="true"/>
+          <w:cantSplit/>
         </w:trPr>
         <w:tc>
           <w:tcPr>
@@ -142,7 +143,9 @@
         </w:tc>
       </w:tr>
       <w:tr>
-        <w:trPr/>
+        <w:trPr>
+          <w:cantSplit/>
+        </w:trPr>
         <w:tc>
           <w:tcPr>
             <w:tcW w:type="dxa" w:w="2448"/>
@@ -193,13 +196,15 @@
                 <w:color w:val="222222"/>
                 <w:sz w:val="16"/>
               </w:rPr>
-              <w:t xml:space="preserve">GO для передачи на M1 и офлайн-проверки</w:t>
+              <w:t>GO для передачи на M1 и офлайн-проверки; дополнение Resolve D-122 также прошло аудит</w:t>
             </w:r>
           </w:p>
         </w:tc>
       </w:tr>
       <w:tr>
-        <w:trPr/>
+        <w:trPr>
+          <w:cantSplit/>
+        </w:trPr>
         <w:tc>
           <w:tcPr>
             <w:tcW w:type="dxa" w:w="2448"/>
@@ -256,7 +261,9 @@
         </w:tc>
       </w:tr>
       <w:tr>
-        <w:trPr/>
+        <w:trPr>
+          <w:cantSplit/>
+        </w:trPr>
         <w:tc>
           <w:tcPr>
             <w:tcW w:type="dxa" w:w="2448"/>
@@ -307,13 +314,15 @@
                 <w:color w:val="222222"/>
                 <w:sz w:val="16"/>
               </w:rPr>
-              <w:t xml:space="preserve">Лишних обращений стало меньше; точный процент ещё не измерен</w:t>
+              <w:t>Штатный Resolve: 0 обращений; selective: максимум 1, но режим пока выключен</w:t>
             </w:r>
           </w:p>
         </w:tc>
       </w:tr>
       <w:tr>
-        <w:trPr/>
+        <w:trPr>
+          <w:cantSplit/>
+        </w:trPr>
         <w:tc>
           <w:tcPr>
             <w:tcW w:type="dxa" w:w="2448"/>
@@ -337,7 +346,7 @@
                 <w:color w:val="222222"/>
                 <w:sz w:val="16"/>
               </w:rPr>
-              <w:t xml:space="preserve">Проверенный кодовый SHA</w:t>
+              <w:t>Кодовый SHA D-122</w:t>
             </w:r>
           </w:p>
         </w:tc>
@@ -364,7 +373,7 @@
                 <w:color w:val="222222"/>
                 <w:sz w:val="16"/>
               </w:rPr>
-              <w:t xml:space="preserve">fb7eed4233f70c434f757eb78bde0847da04c47d</w:t>
+              <w:t>dea4a54bd4ab9a5ac4842468717cf6aa2dec2359</w:t>
             </w:r>
           </w:p>
         </w:tc>
@@ -376,13 +385,7 @@
         <w:widowControl/>
       </w:pPr>
       <w:r>
-        <w:t xml:space="preserve">Дата: 2026-08-17. Подготовлено Codex, независимо проверено Claude. Документ написан</w:t>
-      </w:r>
-      <w:r>
-        <w:t xml:space="preserve"> </w:t>
-      </w:r>
-      <w:r>
-        <w:t xml:space="preserve">для чтения без технического образования. Сложные слова расшифрованы при первом появлении.</w:t>
+        <w:t>Дата: 2026-08-18. Основной выпуск Quality v3: fb7eed42. Дополнение Resolve D-122: dea4a54b. Подготовлено Codex, независимо проверено Claude. Документ написан для чтения без технического образования.</w:t>
       </w:r>
     </w:p>
     <w:bookmarkStart w:id="9" w:name="что-это-за-выпуск-в-одном-абзаце"/>
@@ -453,32 +456,7 @@
         <w:widowControl/>
       </w:pPr>
       <w:r>
-        <w:t xml:space="preserve">Побочный, но важный эффект: там, где вывод делать нельзя, платная модель вообще не</w:t>
-      </w:r>
-      <w:r>
-        <w:t xml:space="preserve"> </w:t>
-      </w:r>
-      <w:r>
-        <w:t xml:space="preserve">вызывается. Это экономит деньги, но экономия пока доказана как</w:t>
-      </w:r>
-      <w:r>
-        <w:t xml:space="preserve"> </w:t>
-      </w:r>
-      <w:r>
-        <w:rPr>
-          <w:b/>
-          <w:bCs/>
-        </w:rPr>
-        <w:t xml:space="preserve">механизм</w:t>
-      </w:r>
-      <w:r>
-        <w:t xml:space="preserve">, а не как</w:t>
-      </w:r>
-      <w:r>
-        <w:t xml:space="preserve"> </w:t>
-      </w:r>
-      <w:r>
-        <w:t xml:space="preserve">цифра. Точную цифру даст только пилот.</w:t>
+        <w:t>Побочный, но важный эффект: там, где вывод делать нельзя, платная модель вообще не вызывается. Это экономит деньги, но экономия пока доказана как механизм, а не как цифра. Точную цифру даст только пилот. 18 августа добавлен безопасный режим выборочного улучшения Resolve. Он по умолчанию выключен и не входит в живую службу до слепой проверки на 10, 50 и 100 уже распознанных звонках.</w:t>
       </w:r>
     </w:p>
     <w:p>
@@ -520,6 +498,7 @@
         <w:trPr>
           <w:tblHeader w:val="on"/>
           <w:tblHeader w:val="true"/>
+          <w:cantSplit/>
         </w:trPr>
         <w:tc>
           <w:tcPr>
@@ -579,7 +558,9 @@
         </w:tc>
       </w:tr>
       <w:tr>
-        <w:trPr/>
+        <w:trPr>
+          <w:cantSplit/>
+        </w:trPr>
         <w:tc>
           <w:tcPr>
             <w:tcW w:type="dxa" w:w="2448"/>
@@ -634,7 +615,9 @@
         </w:tc>
       </w:tr>
       <w:tr>
-        <w:trPr/>
+        <w:trPr>
+          <w:cantSplit/>
+        </w:trPr>
         <w:tc>
           <w:tcPr>
             <w:tcW w:type="dxa" w:w="2448"/>
@@ -689,7 +672,9 @@
         </w:tc>
       </w:tr>
       <w:tr>
-        <w:trPr/>
+        <w:trPr>
+          <w:cantSplit/>
+        </w:trPr>
         <w:tc>
           <w:tcPr>
             <w:tcW w:type="dxa" w:w="2448"/>
@@ -744,7 +729,9 @@
         </w:tc>
       </w:tr>
       <w:tr>
-        <w:trPr/>
+        <w:trPr>
+          <w:cantSplit/>
+        </w:trPr>
         <w:tc>
           <w:tcPr>
             <w:tcW w:type="dxa" w:w="2448"/>
@@ -825,7 +812,9 @@
         </w:tc>
       </w:tr>
       <w:tr>
-        <w:trPr/>
+        <w:trPr>
+          <w:cantSplit/>
+        </w:trPr>
         <w:tc>
           <w:tcPr>
             <w:tcW w:type="dxa" w:w="2448"/>
@@ -874,13 +863,15 @@
                 <w:color w:val="222222"/>
                 <w:sz w:val="16"/>
               </w:rPr>
-              <w:t xml:space="preserve">Шаг между распознаванием и анализом: собирает из двух дорожек один разговор. В службе работает без модели.</w:t>
+              <w:t>Шаг между распознаванием и анализом: собирает из двух дорожек один разговор. По умолчанию работает без модели. Новый режим selective пока выключен; после отдельной приёмки он сможет один раз обратиться к лёгкой модели только при существенном расхождении Whisper и GigaAM.</w:t>
             </w:r>
           </w:p>
         </w:tc>
       </w:tr>
       <w:tr>
-        <w:trPr/>
+        <w:trPr>
+          <w:cantSplit/>
+        </w:trPr>
         <w:tc>
           <w:tcPr>
             <w:tcW w:type="dxa" w:w="2448"/>
@@ -935,7 +926,9 @@
         </w:tc>
       </w:tr>
       <w:tr>
-        <w:trPr/>
+        <w:trPr>
+          <w:cantSplit/>
+        </w:trPr>
         <w:tc>
           <w:tcPr>
             <w:tcW w:type="dxa" w:w="2448"/>
@@ -990,7 +983,9 @@
         </w:tc>
       </w:tr>
       <w:tr>
-        <w:trPr/>
+        <w:trPr>
+          <w:cantSplit/>
+        </w:trPr>
         <w:tc>
           <w:tcPr>
             <w:tcW w:type="dxa" w:w="2448"/>
@@ -1039,38 +1034,15 @@
                 <w:color w:val="222222"/>
                 <w:sz w:val="16"/>
               </w:rPr>
-              <w:t xml:space="preserve">Точный номер версии кода, например</w:t>
-            </w:r>
-            <w:r>
-              <w:rPr>
-                <w:rFonts w:ascii="Calibri" w:hAnsi="Calibri" w:eastAsia="Calibri"/>
-                <w:color w:val="222222"/>
-                <w:sz w:val="16"/>
-              </w:rPr>
-              <w:t xml:space="preserve"> </w:t>
-            </w:r>
-            <w:r>
-              <w:rPr>
-                <w:rStyle w:val="VerbatimChar"/>
-                <w:rFonts w:ascii="Calibri" w:hAnsi="Calibri" w:eastAsia="Calibri"/>
-                <w:color w:val="222222"/>
-                <w:sz w:val="16"/>
-              </w:rPr>
-              <w:t xml:space="preserve">fb7eed42</w:t>
-            </w:r>
-            <w:r>
-              <w:rPr>
-                <w:rFonts w:ascii="Calibri" w:hAnsi="Calibri" w:eastAsia="Calibri"/>
-                <w:color w:val="222222"/>
-                <w:sz w:val="16"/>
-              </w:rPr>
-              <w:t xml:space="preserve">. По нему видно, что именно проверено и куда возвращаться при откате.</w:t>
+              <w:t>Точный номер версии кода, например dea4a54b. По нему видно, что именно проверено и куда возвращаться при откате.</w:t>
             </w:r>
           </w:p>
         </w:tc>
       </w:tr>
       <w:tr>
-        <w:trPr/>
+        <w:trPr>
+          <w:cantSplit/>
+        </w:trPr>
         <w:tc>
           <w:tcPr>
             <w:tcW w:type="dxa" w:w="2448"/>
@@ -1222,6 +1194,7 @@
         <w:trPr>
           <w:tblHeader w:val="on"/>
           <w:tblHeader w:val="true"/>
+          <w:cantSplit/>
         </w:trPr>
         <w:tc>
           <w:tcPr>
@@ -1331,8 +1304,27 @@
                 <w:color w:val="17324D"/>
                 <w:sz w:val="16"/>
               </w:rPr>
-              <w:t xml:space="preserve">Стало (выпуск</w:t>
-            </w:r>
+              <w:t>Стало (код dea4a54b)</w:t>
+            </w:r>
+          </w:p>
+        </w:tc>
+        <w:tc>
+          <w:tcPr>
+            <w:tcW w:type="dxa" w:w="2276"/>
+            <w:tcMar>
+              <w:top w:w="80" w:type="dxa"/>
+              <w:bottom w:w="80" w:type="dxa"/>
+              <w:start w:w="120" w:type="dxa"/>
+              <w:end w:w="120" w:type="dxa"/>
+            </w:tcMar>
+            <w:vAlign w:val="top"/>
+            <w:shd w:fill="DCE6F1"/>
+          </w:tcPr>
+          <w:p>
+            <w:pPr>
+              <w:pStyle w:val="Compact"/>
+              <w:spacing w:before="0" w:after="40" w:line="240" w:lineRule="auto"/>
+            </w:pPr>
             <w:r>
               <w:rPr>
                 <w:rFonts w:ascii="Calibri" w:hAnsi="Calibri" w:eastAsia="Calibri"/>
@@ -1340,60 +1332,15 @@
                 <w:color w:val="17324D"/>
                 <w:sz w:val="16"/>
               </w:rPr>
-              <w:t xml:space="preserve"> </w:t>
-            </w:r>
-            <w:r>
-              <w:rPr>
-                <w:rStyle w:val="VerbatimChar"/>
-                <w:rFonts w:ascii="Calibri" w:hAnsi="Calibri" w:eastAsia="Calibri"/>
-                <w:b/>
-                <w:color w:val="17324D"/>
-                <w:sz w:val="16"/>
-              </w:rPr>
-              <w:t xml:space="preserve">fb7eed42</w:t>
-            </w:r>
-            <w:r>
-              <w:rPr>
-                <w:rFonts w:ascii="Calibri" w:hAnsi="Calibri" w:eastAsia="Calibri"/>
-                <w:b/>
-                <w:color w:val="17324D"/>
-                <w:sz w:val="16"/>
-              </w:rPr>
-              <w:t xml:space="preserve">)</w:t>
-            </w:r>
-          </w:p>
-        </w:tc>
-        <w:tc>
-          <w:tcPr>
-            <w:tcW w:type="dxa" w:w="2276"/>
-            <w:tcMar>
-              <w:top w:w="80" w:type="dxa"/>
-              <w:bottom w:w="80" w:type="dxa"/>
-              <w:start w:w="120" w:type="dxa"/>
-              <w:end w:w="120" w:type="dxa"/>
-            </w:tcMar>
-            <w:vAlign w:val="top"/>
-            <w:shd w:fill="DCE6F1"/>
-          </w:tcPr>
-          <w:p>
-            <w:pPr>
-              <w:pStyle w:val="Compact"/>
-              <w:spacing w:before="0" w:after="40" w:line="240" w:lineRule="auto"/>
-            </w:pPr>
-            <w:r>
-              <w:rPr>
-                <w:rFonts w:ascii="Calibri" w:hAnsi="Calibri" w:eastAsia="Calibri"/>
-                <w:b/>
-                <w:color w:val="17324D"/>
-                <w:sz w:val="16"/>
-              </w:rPr>
               <w:t xml:space="preserve">Зачем</w:t>
             </w:r>
           </w:p>
         </w:tc>
       </w:tr>
       <w:tr>
-        <w:trPr/>
+        <w:trPr>
+          <w:cantSplit/>
+        </w:trPr>
         <w:tc>
           <w:tcPr>
             <w:tcW w:type="dxa" w:w="1518"/>
@@ -1533,7 +1480,9 @@
         </w:tc>
       </w:tr>
       <w:tr>
-        <w:trPr/>
+        <w:trPr>
+          <w:cantSplit/>
+        </w:trPr>
         <w:tc>
           <w:tcPr>
             <w:tcW w:type="dxa" w:w="1518"/>
@@ -1665,7 +1614,9 @@
         </w:tc>
       </w:tr>
       <w:tr>
-        <w:trPr/>
+        <w:trPr>
+          <w:cantSplit/>
+        </w:trPr>
         <w:tc>
           <w:tcPr>
             <w:tcW w:type="dxa" w:w="1518"/>
@@ -1798,7 +1749,9 @@
         </w:tc>
       </w:tr>
       <w:tr>
-        <w:trPr/>
+        <w:trPr>
+          <w:cantSplit/>
+        </w:trPr>
         <w:tc>
           <w:tcPr>
             <w:tcW w:type="dxa" w:w="1518"/>
@@ -1905,7 +1858,9 @@
         </w:tc>
       </w:tr>
       <w:tr>
-        <w:trPr/>
+        <w:trPr>
+          <w:cantSplit/>
+        </w:trPr>
         <w:tc>
           <w:tcPr>
             <w:tcW w:type="dxa" w:w="1518"/>
@@ -2012,7 +1967,9 @@
         </w:tc>
       </w:tr>
       <w:tr>
-        <w:trPr/>
+        <w:trPr>
+          <w:cantSplit/>
+        </w:trPr>
         <w:tc>
           <w:tcPr>
             <w:tcW w:type="dxa" w:w="1518"/>
@@ -2119,7 +2076,9 @@
         </w:tc>
       </w:tr>
       <w:tr>
-        <w:trPr/>
+        <w:trPr>
+          <w:cantSplit/>
+        </w:trPr>
         <w:tc>
           <w:tcPr>
             <w:tcW w:type="dxa" w:w="1518"/>
@@ -2226,7 +2185,9 @@
         </w:tc>
       </w:tr>
       <w:tr>
-        <w:trPr/>
+        <w:trPr>
+          <w:cantSplit/>
+        </w:trPr>
         <w:tc>
           <w:tcPr>
             <w:tcW w:type="dxa" w:w="1518"/>
@@ -2333,7 +2294,9 @@
         </w:tc>
       </w:tr>
       <w:tr>
-        <w:trPr/>
+        <w:trPr>
+          <w:cantSplit/>
+        </w:trPr>
         <w:tc>
           <w:tcPr>
             <w:tcW w:type="dxa" w:w="1518"/>
@@ -2518,23 +2481,7 @@
                 <w:color w:val="222222"/>
                 <w:sz w:val="16"/>
               </w:rPr>
-              <w:t xml:space="preserve">RESOLVE_LLM_PROVIDER=off</w:t>
-            </w:r>
-            <w:r>
-              <w:rPr>
-                <w:rFonts w:ascii="Calibri" w:hAnsi="Calibri" w:eastAsia="Calibri"/>
-                <w:color w:val="222222"/>
-                <w:sz w:val="16"/>
-              </w:rPr>
-              <w:t xml:space="preserve"> </w:t>
-            </w:r>
-            <w:r>
-              <w:rPr>
-                <w:rFonts w:ascii="Calibri" w:hAnsi="Calibri" w:eastAsia="Calibri"/>
-                <w:color w:val="222222"/>
-                <w:sz w:val="16"/>
-              </w:rPr>
-              <w:t xml:space="preserve">жёстко задан во всех режимах службы. Счётчик обращений Resolve к модели = 0.</w:t>
+              <w:t>По умолчанию модель выключена. Добавлен режим selective: максимум один вызов на весь звонок, только при существенном расхождении и подтверждённых ролях. Правка не может менять роли, порядок, таймкоды, числа, даты, валюты, отрицания, ФИО и другие защищённые факты. Режим пока не включён.</w:t>
             </w:r>
           </w:p>
         </w:tc>
@@ -2560,7 +2507,7 @@
                 <w:color w:val="222222"/>
                 <w:sz w:val="16"/>
               </w:rPr>
-              <w:t xml:space="preserve">Дорожки Mango уже задают стороны — модель здесь только дублировала Analyse и платно.</w:t>
+              <w:t>Сохраняем низкий расход, но после отдельной проверки сможем точечно исправлять явные ошибки распознавания без повторного Whisper.</w:t>
             </w:r>
           </w:p>
         </w:tc>
@@ -2590,550 +2537,72 @@
           <w:color w:val="17324D"/>
           <w:sz w:val="16"/>
         </w:rPr>
-        <w:t xml:space="preserve">1. Mango: скачивание записи и метаданных</w:t>
-      </w:r>
-      <w:r>
-        <w:rPr>
-          <w:rFonts w:ascii="Consolas" w:hAnsi="Consolas" w:eastAsia="Consolas"/>
-          <w:color w:val="17324D"/>
-          <w:sz w:val="16"/>
-        </w:rPr>
+        <w:t>1. Mango: скачивание записи и метаданных</w:t>
         <w:br/>
-      </w:r>
-      <w:r>
-        <w:rPr>
-          <w:rStyle w:val="VerbatimChar"/>
-          <w:rFonts w:ascii="Consolas" w:hAnsi="Consolas" w:eastAsia="Consolas"/>
-          <w:color w:val="17324D"/>
-          <w:sz w:val="16"/>
-        </w:rPr>
         <w:t xml:space="preserve">        ↓</w:t>
-      </w:r>
-      <w:r>
-        <w:rPr>
-          <w:rFonts w:ascii="Consolas" w:hAnsi="Consolas" w:eastAsia="Consolas"/>
-          <w:color w:val="17324D"/>
-          <w:sz w:val="16"/>
-        </w:rPr>
         <w:br/>
-      </w:r>
-      <w:r>
-        <w:rPr>
-          <w:rStyle w:val="VerbatimChar"/>
-          <w:rFonts w:ascii="Consolas" w:hAnsi="Consolas" w:eastAsia="Consolas"/>
-          <w:color w:val="17324D"/>
-          <w:sz w:val="16"/>
-        </w:rPr>
-        <w:t xml:space="preserve">2. Ingest: запись заводится в рабочую базу</w:t>
-      </w:r>
-      <w:r>
-        <w:rPr>
-          <w:rFonts w:ascii="Consolas" w:hAnsi="Consolas" w:eastAsia="Consolas"/>
-          <w:color w:val="17324D"/>
-          <w:sz w:val="16"/>
-        </w:rPr>
+        <w:t>2. Ingest: запись заводится в рабочую базу</w:t>
         <w:br/>
-      </w:r>
-      <w:r>
-        <w:rPr>
-          <w:rStyle w:val="VerbatimChar"/>
-          <w:rFonts w:ascii="Consolas" w:hAnsi="Consolas" w:eastAsia="Consolas"/>
-          <w:color w:val="17324D"/>
-          <w:sz w:val="16"/>
-        </w:rPr>
         <w:t xml:space="preserve">        ↓</w:t>
-      </w:r>
-      <w:r>
-        <w:rPr>
-          <w:rFonts w:ascii="Consolas" w:hAnsi="Consolas" w:eastAsia="Consolas"/>
-          <w:color w:val="17324D"/>
-          <w:sz w:val="16"/>
-        </w:rPr>
         <w:br/>
-      </w:r>
-      <w:r>
-        <w:rPr>
-          <w:rStyle w:val="VerbatimChar"/>
-          <w:rFonts w:ascii="Consolas" w:hAnsi="Consolas" w:eastAsia="Consolas"/>
-          <w:color w:val="17324D"/>
-          <w:sz w:val="16"/>
-        </w:rPr>
-        <w:t xml:space="preserve">3. Распознавание: Whisper + GigaAM (локально, на нашем железе)</w:t>
-      </w:r>
-      <w:r>
-        <w:rPr>
-          <w:rFonts w:ascii="Consolas" w:hAnsi="Consolas" w:eastAsia="Consolas"/>
-          <w:color w:val="17324D"/>
-          <w:sz w:val="16"/>
-        </w:rPr>
+        <w:t>3. Распознавание: Whisper + GigaAM (локально, на нашем железе)</w:t>
         <w:br/>
-      </w:r>
-      <w:r>
-        <w:rPr>
-          <w:rStyle w:val="VerbatimChar"/>
-          <w:rFonts w:ascii="Consolas" w:hAnsi="Consolas" w:eastAsia="Consolas"/>
-          <w:color w:val="17324D"/>
-          <w:sz w:val="16"/>
-        </w:rPr>
         <w:t xml:space="preserve">        ↓</w:t>
-      </w:r>
-      <w:r>
-        <w:rPr>
-          <w:rFonts w:ascii="Consolas" w:hAnsi="Consolas" w:eastAsia="Consolas"/>
-          <w:color w:val="17324D"/>
-          <w:sz w:val="16"/>
-        </w:rPr>
         <w:br/>
-      </w:r>
-      <w:r>
-        <w:rPr>
-          <w:rStyle w:val="VerbatimChar"/>
-          <w:rFonts w:ascii="Consolas" w:hAnsi="Consolas" w:eastAsia="Consolas"/>
-          <w:color w:val="17324D"/>
-          <w:sz w:val="16"/>
-        </w:rPr>
-        <w:t xml:space="preserve">4. Resolve: сборка одного разговора из двух дорожек (без модели)</w:t>
-      </w:r>
-      <w:r>
-        <w:rPr>
-          <w:rFonts w:ascii="Consolas" w:hAnsi="Consolas" w:eastAsia="Consolas"/>
-          <w:color w:val="17324D"/>
-          <w:sz w:val="16"/>
-        </w:rPr>
+        <w:t>4. Resolve: сборка разговора. По умолчанию без модели; selective пока</w:t>
         <w:br/>
-      </w:r>
-      <w:r>
-        <w:rPr>
-          <w:rStyle w:val="VerbatimChar"/>
-          <w:rFonts w:ascii="Consolas" w:hAnsi="Consolas" w:eastAsia="Consolas"/>
-          <w:color w:val="17324D"/>
-          <w:sz w:val="16"/>
-        </w:rPr>
+        <w:t xml:space="preserve">   выключен и после приёмки сможет сделать не более 1 вызова</w:t>
+        <w:br/>
         <w:t xml:space="preserve">        ↓</w:t>
-      </w:r>
-      <w:r>
-        <w:rPr>
-          <w:rFonts w:ascii="Consolas" w:hAnsi="Consolas" w:eastAsia="Consolas"/>
-          <w:color w:val="17324D"/>
-          <w:sz w:val="16"/>
-        </w:rPr>
         <w:br/>
-      </w:r>
-      <w:r>
-        <w:rPr>
-          <w:rStyle w:val="VerbatimChar"/>
-          <w:rFonts w:ascii="Consolas" w:hAnsi="Consolas" w:eastAsia="Consolas"/>
-          <w:color w:val="17324D"/>
-          <w:sz w:val="16"/>
-        </w:rPr>
-        <w:t xml:space="preserve">5. Контракт диалога: реплики нумеруются T0001…, ставятся таймкоды,</w:t>
-      </w:r>
-      <w:r>
-        <w:rPr>
-          <w:rFonts w:ascii="Consolas" w:hAnsi="Consolas" w:eastAsia="Consolas"/>
-          <w:color w:val="17324D"/>
-          <w:sz w:val="16"/>
-        </w:rPr>
+        <w:t>5. Контракт диалога: реплики нумеруются T0001…, ставятся таймкоды,</w:t>
         <w:br/>
-      </w:r>
-      <w:r>
-        <w:rPr>
-          <w:rStyle w:val="VerbatimChar"/>
-          <w:rFonts w:ascii="Consolas" w:hAnsi="Consolas" w:eastAsia="Consolas"/>
-          <w:color w:val="17324D"/>
-          <w:sz w:val="16"/>
-        </w:rPr>
         <w:t xml:space="preserve">   считается решение «роли доверенные / недоверенные»</w:t>
-      </w:r>
-      <w:r>
-        <w:rPr>
-          <w:rFonts w:ascii="Consolas" w:hAnsi="Consolas" w:eastAsia="Consolas"/>
-          <w:color w:val="17324D"/>
-          <w:sz w:val="16"/>
-        </w:rPr>
         <w:br/>
-      </w:r>
-      <w:r>
-        <w:rPr>
-          <w:rStyle w:val="VerbatimChar"/>
-          <w:rFonts w:ascii="Consolas" w:hAnsi="Consolas" w:eastAsia="Consolas"/>
-          <w:color w:val="17324D"/>
-          <w:sz w:val="16"/>
-        </w:rPr>
         <w:t xml:space="preserve">        ↓</w:t>
-      </w:r>
-      <w:r>
-        <w:rPr>
-          <w:rFonts w:ascii="Consolas" w:hAnsi="Consolas" w:eastAsia="Consolas"/>
-          <w:color w:val="17324D"/>
-          <w:sz w:val="16"/>
-        </w:rPr>
         <w:br/>
-      </w:r>
-      <w:r>
-        <w:rPr>
-          <w:rStyle w:val="VerbatimChar"/>
-          <w:rFonts w:ascii="Consolas" w:hAnsi="Consolas" w:eastAsia="Consolas"/>
-          <w:color w:val="17324D"/>
-          <w:sz w:val="16"/>
-        </w:rPr>
         <w:t xml:space="preserve">   ┌───────────────────────────────┬──────────────────────────────────┐</w:t>
-      </w:r>
-      <w:r>
-        <w:rPr>
-          <w:rFonts w:ascii="Consolas" w:hAnsi="Consolas" w:eastAsia="Consolas"/>
-          <w:color w:val="17324D"/>
-          <w:sz w:val="16"/>
-        </w:rPr>
         <w:br/>
-      </w:r>
-      <w:r>
-        <w:rPr>
-          <w:rStyle w:val="VerbatimChar"/>
-          <w:rFonts w:ascii="Consolas" w:hAnsi="Consolas" w:eastAsia="Consolas"/>
-          <w:color w:val="17324D"/>
-          <w:sz w:val="16"/>
-        </w:rPr>
         <w:t xml:space="preserve">   │ роли НЕ доказаны              │ роли доказаны Mango              │</w:t>
-      </w:r>
-      <w:r>
-        <w:rPr>
-          <w:rFonts w:ascii="Consolas" w:hAnsi="Consolas" w:eastAsia="Consolas"/>
-          <w:color w:val="17324D"/>
-          <w:sz w:val="16"/>
-        </w:rPr>
         <w:br/>
-      </w:r>
-      <w:r>
-        <w:rPr>
-          <w:rStyle w:val="VerbatimChar"/>
-          <w:rFonts w:ascii="Consolas" w:hAnsi="Consolas" w:eastAsia="Consolas"/>
-          <w:color w:val="17324D"/>
-          <w:sz w:val="16"/>
-        </w:rPr>
         <w:t xml:space="preserve">   │ (или звонок доказанно пустой) │                                  │</w:t>
-      </w:r>
-      <w:r>
-        <w:rPr>
-          <w:rFonts w:ascii="Consolas" w:hAnsi="Consolas" w:eastAsia="Consolas"/>
-          <w:color w:val="17324D"/>
-          <w:sz w:val="16"/>
-        </w:rPr>
         <w:br/>
-      </w:r>
-      <w:r>
-        <w:rPr>
-          <w:rStyle w:val="VerbatimChar"/>
-          <w:rFonts w:ascii="Consolas" w:hAnsi="Consolas" w:eastAsia="Consolas"/>
-          <w:color w:val="17324D"/>
-          <w:sz w:val="16"/>
-        </w:rPr>
         <w:t xml:space="preserve">   ↓                               ↓                                  │</w:t>
-      </w:r>
-      <w:r>
-        <w:rPr>
-          <w:rFonts w:ascii="Consolas" w:hAnsi="Consolas" w:eastAsia="Consolas"/>
-          <w:color w:val="17324D"/>
-          <w:sz w:val="16"/>
-        </w:rPr>
         <w:br/>
-      </w:r>
-      <w:r>
-        <w:rPr>
-          <w:rStyle w:val="VerbatimChar"/>
-          <w:rFonts w:ascii="Consolas" w:hAnsi="Consolas" w:eastAsia="Consolas"/>
-          <w:color w:val="17324D"/>
-          <w:sz w:val="16"/>
-        </w:rPr>
-        <w:t xml:space="preserve">6a. Детерминированный результат:   6b. Analyse: один вызов Codex      │</w:t>
-      </w:r>
-      <w:r>
-        <w:rPr>
-          <w:rFonts w:ascii="Consolas" w:hAnsi="Consolas" w:eastAsia="Consolas"/>
-          <w:color w:val="17324D"/>
-          <w:sz w:val="16"/>
-        </w:rPr>
+        <w:t>6a. Детерминированный результат:   6b. Analyse: один вызов Codex      │</w:t>
         <w:br/>
-      </w:r>
-      <w:r>
-        <w:rPr>
-          <w:rStyle w:val="VerbatimChar"/>
-          <w:rFonts w:ascii="Consolas" w:hAnsi="Consolas" w:eastAsia="Consolas"/>
-          <w:color w:val="17324D"/>
-          <w:sz w:val="16"/>
-        </w:rPr>
         <w:t xml:space="preserve">    «Спикер A/B», полный текст,        (профиль compact)              │</w:t>
-      </w:r>
-      <w:r>
-        <w:rPr>
-          <w:rFonts w:ascii="Consolas" w:hAnsi="Consolas" w:eastAsia="Consolas"/>
-          <w:color w:val="17324D"/>
-          <w:sz w:val="16"/>
-        </w:rPr>
         <w:br/>
-      </w:r>
-      <w:r>
-        <w:rPr>
-          <w:rStyle w:val="VerbatimChar"/>
-          <w:rFonts w:ascii="Consolas" w:hAnsi="Consolas" w:eastAsia="Consolas"/>
-          <w:color w:val="17324D"/>
-          <w:sz w:val="16"/>
-        </w:rPr>
         <w:t xml:space="preserve">    нейтральные темы, «нужна           ↓                              │</w:t>
-      </w:r>
-      <w:r>
-        <w:rPr>
-          <w:rFonts w:ascii="Consolas" w:hAnsi="Consolas" w:eastAsia="Consolas"/>
-          <w:color w:val="17324D"/>
-          <w:sz w:val="16"/>
-        </w:rPr>
         <w:br/>
-      </w:r>
-      <w:r>
-        <w:rPr>
-          <w:rStyle w:val="VerbatimChar"/>
-          <w:rFonts w:ascii="Consolas" w:hAnsi="Consolas" w:eastAsia="Consolas"/>
-          <w:color w:val="17324D"/>
-          <w:sz w:val="16"/>
-        </w:rPr>
         <w:t xml:space="preserve">    проверка». Модель НЕ вызвана.  6c. Если ответ явно неполон —      │</w:t>
-      </w:r>
-      <w:r>
-        <w:rPr>
-          <w:rFonts w:ascii="Consolas" w:hAnsi="Consolas" w:eastAsia="Consolas"/>
-          <w:color w:val="17324D"/>
-          <w:sz w:val="16"/>
-        </w:rPr>
         <w:br/>
-      </w:r>
-      <w:r>
-        <w:rPr>
-          <w:rStyle w:val="VerbatimChar"/>
-          <w:rFonts w:ascii="Consolas" w:hAnsi="Consolas" w:eastAsia="Consolas"/>
-          <w:color w:val="17324D"/>
-          <w:sz w:val="16"/>
-        </w:rPr>
         <w:t xml:space="preserve">                                        один вызов full (эскалация)   │</w:t>
-      </w:r>
-      <w:r>
-        <w:rPr>
-          <w:rFonts w:ascii="Consolas" w:hAnsi="Consolas" w:eastAsia="Consolas"/>
-          <w:color w:val="17324D"/>
-          <w:sz w:val="16"/>
-        </w:rPr>
         <w:br/>
-      </w:r>
-      <w:r>
-        <w:rPr>
-          <w:rStyle w:val="VerbatimChar"/>
-          <w:rFonts w:ascii="Consolas" w:hAnsi="Consolas" w:eastAsia="Consolas"/>
-          <w:color w:val="17324D"/>
-          <w:sz w:val="16"/>
-        </w:rPr>
         <w:t xml:space="preserve">                                       ↓                              │</w:t>
-      </w:r>
-      <w:r>
-        <w:rPr>
-          <w:rFonts w:ascii="Consolas" w:hAnsi="Consolas" w:eastAsia="Consolas"/>
-          <w:color w:val="17324D"/>
-          <w:sz w:val="16"/>
-        </w:rPr>
         <w:br/>
-      </w:r>
-      <w:r>
-        <w:rPr>
-          <w:rStyle w:val="VerbatimChar"/>
-          <w:rFonts w:ascii="Consolas" w:hAnsi="Consolas" w:eastAsia="Consolas"/>
-          <w:color w:val="17324D"/>
-          <w:sz w:val="16"/>
-        </w:rPr>
         <w:t xml:space="preserve">                                   6d. Проверка доказательств:        │</w:t>
-      </w:r>
-      <w:r>
-        <w:rPr>
-          <w:rFonts w:ascii="Consolas" w:hAnsi="Consolas" w:eastAsia="Consolas"/>
-          <w:color w:val="17324D"/>
-          <w:sz w:val="16"/>
-        </w:rPr>
         <w:br/>
-      </w:r>
-      <w:r>
-        <w:rPr>
-          <w:rStyle w:val="VerbatimChar"/>
-          <w:rFonts w:ascii="Consolas" w:hAnsi="Consolas" w:eastAsia="Consolas"/>
-          <w:color w:val="17324D"/>
-          <w:sz w:val="16"/>
-        </w:rPr>
         <w:t xml:space="preserve">                                       вывод без ссылки на реплику    │</w:t>
-      </w:r>
-      <w:r>
-        <w:rPr>
-          <w:rFonts w:ascii="Consolas" w:hAnsi="Consolas" w:eastAsia="Consolas"/>
-          <w:color w:val="17324D"/>
-          <w:sz w:val="16"/>
-        </w:rPr>
         <w:br/>
-      </w:r>
-      <w:r>
-        <w:rPr>
-          <w:rStyle w:val="VerbatimChar"/>
-          <w:rFonts w:ascii="Consolas" w:hAnsi="Consolas" w:eastAsia="Consolas"/>
-          <w:color w:val="17324D"/>
-          <w:sz w:val="16"/>
-        </w:rPr>
         <w:t xml:space="preserve">                                       удаляется                      │</w:t>
-      </w:r>
-      <w:r>
-        <w:rPr>
-          <w:rFonts w:ascii="Consolas" w:hAnsi="Consolas" w:eastAsia="Consolas"/>
-          <w:color w:val="17324D"/>
-          <w:sz w:val="16"/>
-        </w:rPr>
         <w:br/>
-      </w:r>
-      <w:r>
-        <w:rPr>
-          <w:rStyle w:val="VerbatimChar"/>
-          <w:rFonts w:ascii="Consolas" w:hAnsi="Consolas" w:eastAsia="Consolas"/>
-          <w:color w:val="17324D"/>
-          <w:sz w:val="16"/>
-        </w:rPr>
         <w:t xml:space="preserve">   └───────────────────────────────┴──────────────────────────────────┘</w:t>
-      </w:r>
-      <w:r>
-        <w:rPr>
-          <w:rFonts w:ascii="Consolas" w:hAnsi="Consolas" w:eastAsia="Consolas"/>
-          <w:color w:val="17324D"/>
-          <w:sz w:val="16"/>
-        </w:rPr>
         <w:br/>
-      </w:r>
-      <w:r>
-        <w:rPr>
-          <w:rStyle w:val="VerbatimChar"/>
-          <w:rFonts w:ascii="Consolas" w:hAnsi="Consolas" w:eastAsia="Consolas"/>
-          <w:color w:val="17324D"/>
-          <w:sz w:val="16"/>
-        </w:rPr>
         <w:t xml:space="preserve">        ↓</w:t>
-      </w:r>
-      <w:r>
-        <w:rPr>
-          <w:rFonts w:ascii="Consolas" w:hAnsi="Consolas" w:eastAsia="Consolas"/>
-          <w:color w:val="17324D"/>
-          <w:sz w:val="16"/>
-        </w:rPr>
         <w:br/>
-      </w:r>
-      <w:r>
-        <w:rPr>
-          <w:rStyle w:val="VerbatimChar"/>
-          <w:rFonts w:ascii="Consolas" w:hAnsi="Consolas" w:eastAsia="Consolas"/>
-          <w:color w:val="17324D"/>
-          <w:sz w:val="16"/>
-        </w:rPr>
-        <w:t xml:space="preserve">7. Нормализация текста и перевод времени в МСК (жёсткие правила, без модели)</w:t>
-      </w:r>
-      <w:r>
-        <w:rPr>
-          <w:rFonts w:ascii="Consolas" w:hAnsi="Consolas" w:eastAsia="Consolas"/>
-          <w:color w:val="17324D"/>
-          <w:sz w:val="16"/>
-        </w:rPr>
+        <w:t>7. Нормализация текста и перевод времени в МСК (жёсткие правила, без модели)</w:t>
         <w:br/>
-      </w:r>
-      <w:r>
-        <w:rPr>
-          <w:rStyle w:val="VerbatimChar"/>
-          <w:rFonts w:ascii="Consolas" w:hAnsi="Consolas" w:eastAsia="Consolas"/>
-          <w:color w:val="17324D"/>
-          <w:sz w:val="16"/>
-        </w:rPr>
         <w:t xml:space="preserve">        ↓</w:t>
-      </w:r>
-      <w:r>
-        <w:rPr>
-          <w:rFonts w:ascii="Consolas" w:hAnsi="Consolas" w:eastAsia="Consolas"/>
-          <w:color w:val="17324D"/>
-          <w:sz w:val="16"/>
-        </w:rPr>
         <w:br/>
-      </w:r>
-      <w:r>
-        <w:rPr>
-          <w:rStyle w:val="VerbatimChar"/>
-          <w:rFonts w:ascii="Consolas" w:hAnsi="Consolas" w:eastAsia="Consolas"/>
-          <w:color w:val="17324D"/>
-          <w:sz w:val="16"/>
-        </w:rPr>
-        <w:t xml:space="preserve">8. Учёт: закрытие записи попытки, запись результата в базу,</w:t>
-      </w:r>
-      <w:r>
-        <w:rPr>
-          <w:rFonts w:ascii="Consolas" w:hAnsi="Consolas" w:eastAsia="Consolas"/>
-          <w:color w:val="17324D"/>
-          <w:sz w:val="16"/>
-        </w:rPr>
+        <w:t>8. Учёт: закрытие записи попытки, запись результата в базу,</w:t>
         <w:br/>
-      </w:r>
-      <w:r>
-        <w:rPr>
-          <w:rStyle w:val="VerbatimChar"/>
-          <w:rFonts w:ascii="Consolas" w:hAnsi="Consolas" w:eastAsia="Consolas"/>
-          <w:color w:val="17324D"/>
-          <w:sz w:val="16"/>
-        </w:rPr>
         <w:t xml:space="preserve">   только после этого ответ кладётся в кэш</w:t>
-      </w:r>
-      <w:r>
-        <w:rPr>
-          <w:rFonts w:ascii="Consolas" w:hAnsi="Consolas" w:eastAsia="Consolas"/>
-          <w:color w:val="17324D"/>
-          <w:sz w:val="16"/>
-        </w:rPr>
         <w:br/>
-      </w:r>
-      <w:r>
-        <w:rPr>
-          <w:rStyle w:val="VerbatimChar"/>
-          <w:rFonts w:ascii="Consolas" w:hAnsi="Consolas" w:eastAsia="Consolas"/>
-          <w:color w:val="17324D"/>
-          <w:sz w:val="16"/>
-        </w:rPr>
         <w:t xml:space="preserve">        ↓</w:t>
-      </w:r>
-      <w:r>
-        <w:rPr>
-          <w:rFonts w:ascii="Consolas" w:hAnsi="Consolas" w:eastAsia="Consolas"/>
-          <w:color w:val="17324D"/>
-          <w:sz w:val="16"/>
-        </w:rPr>
         <w:br/>
-      </w:r>
-      <w:r>
-        <w:rPr>
-          <w:rStyle w:val="VerbatimChar"/>
-          <w:rFonts w:ascii="Consolas" w:hAnsi="Consolas" w:eastAsia="Consolas"/>
-          <w:color w:val="17324D"/>
-          <w:sz w:val="16"/>
-        </w:rPr>
-        <w:t xml:space="preserve">9. Выгрузка в Google: 17 столбцов, проверка баланса до записи,</w:t>
-      </w:r>
-      <w:r>
-        <w:rPr>
-          <w:rFonts w:ascii="Consolas" w:hAnsi="Consolas" w:eastAsia="Consolas"/>
-          <w:color w:val="17324D"/>
-          <w:sz w:val="16"/>
-        </w:rPr>
+        <w:t>9. Выгрузка в Google: 17 столбцов, проверка баланса до записи,</w:t>
         <w:br/>
-      </w:r>
-      <w:r>
-        <w:rPr>
-          <w:rStyle w:val="VerbatimChar"/>
-          <w:rFonts w:ascii="Consolas" w:hAnsi="Consolas" w:eastAsia="Consolas"/>
-          <w:color w:val="17324D"/>
-          <w:sz w:val="16"/>
-        </w:rPr>
         <w:t xml:space="preserve">   повтор без изменений = 0 записей. Модель не используется.</w:t>
       </w:r>
     </w:p>
@@ -3341,6 +2810,7 @@
         <w:trPr>
           <w:tblHeader w:val="on"/>
           <w:tblHeader w:val="true"/>
+          <w:cantSplit/>
         </w:trPr>
         <w:tc>
           <w:tcPr>
@@ -3428,7 +2898,9 @@
         </w:tc>
       </w:tr>
       <w:tr>
-        <w:trPr/>
+        <w:trPr>
+          <w:cantSplit/>
+        </w:trPr>
         <w:tc>
           <w:tcPr>
             <w:tcW w:type="dxa" w:w="2088"/>
@@ -3509,7 +2981,9 @@
         </w:tc>
       </w:tr>
       <w:tr>
-        <w:trPr/>
+        <w:trPr>
+          <w:cantSplit/>
+        </w:trPr>
         <w:tc>
           <w:tcPr>
             <w:tcW w:type="dxa" w:w="2088"/>
@@ -3590,7 +3064,9 @@
         </w:tc>
       </w:tr>
       <w:tr>
-        <w:trPr/>
+        <w:trPr>
+          <w:cantSplit/>
+        </w:trPr>
         <w:tc>
           <w:tcPr>
             <w:tcW w:type="dxa" w:w="2088"/>
@@ -3671,7 +3147,9 @@
         </w:tc>
       </w:tr>
       <w:tr>
-        <w:trPr/>
+        <w:trPr>
+          <w:cantSplit/>
+        </w:trPr>
         <w:tc>
           <w:tcPr>
             <w:tcW w:type="dxa" w:w="2088"/>
@@ -3722,7 +3200,7 @@
                 <w:color w:val="222222"/>
                 <w:sz w:val="16"/>
               </w:rPr>
-              <w:t xml:space="preserve">Нет</w:t>
+              <w:t>Нет в штатном режиме; в выключенном selective — не более одного вызова</w:t>
             </w:r>
           </w:p>
         </w:tc>
@@ -3749,54 +3227,15 @@
                 <w:color w:val="222222"/>
                 <w:sz w:val="16"/>
               </w:rPr>
-              <w:t xml:space="preserve">RESOLVE_LLM_PROVIDER=off</w:t>
-            </w:r>
-            <w:r>
-              <w:rPr>
-                <w:rFonts w:ascii="Calibri" w:hAnsi="Calibri" w:eastAsia="Calibri"/>
-                <w:color w:val="222222"/>
-                <w:sz w:val="16"/>
-              </w:rPr>
-              <w:t xml:space="preserve"> </w:t>
-            </w:r>
-            <w:r>
-              <w:rPr>
-                <w:rFonts w:ascii="Calibri" w:hAnsi="Calibri" w:eastAsia="Calibri"/>
-                <w:color w:val="222222"/>
-                <w:sz w:val="16"/>
-              </w:rPr>
-              <w:t xml:space="preserve">задан принудительно во всех режимах службы, включая</w:t>
-            </w:r>
-            <w:r>
-              <w:rPr>
-                <w:rFonts w:ascii="Calibri" w:hAnsi="Calibri" w:eastAsia="Calibri"/>
-                <w:color w:val="222222"/>
-                <w:sz w:val="16"/>
-              </w:rPr>
-              <w:t xml:space="preserve"> </w:t>
-            </w:r>
-            <w:r>
-              <w:rPr>
-                <w:rStyle w:val="VerbatimChar"/>
-                <w:rFonts w:ascii="Calibri" w:hAnsi="Calibri" w:eastAsia="Calibri"/>
-                <w:color w:val="222222"/>
-                <w:sz w:val="16"/>
-              </w:rPr>
-              <w:t xml:space="preserve">controlled_1</w:t>
-            </w:r>
-            <w:r>
-              <w:rPr>
-                <w:rFonts w:ascii="Calibri" w:hAnsi="Calibri" w:eastAsia="Calibri"/>
-                <w:color w:val="222222"/>
-                <w:sz w:val="16"/>
-              </w:rPr>
-              <w:t xml:space="preserve">. Счётчик обращений = 0.</w:t>
+              <w:t>Значение по умолчанию — off. Режим selective существует в коде, но не разрешён для реальных звонков до слепой проверки 10 → 50 → 100.</w:t>
             </w:r>
           </w:p>
         </w:tc>
       </w:tr>
       <w:tr>
-        <w:trPr/>
+        <w:trPr>
+          <w:cantSplit/>
+        </w:trPr>
         <w:tc>
           <w:tcPr>
             <w:tcW w:type="dxa" w:w="2088"/>
@@ -3877,7 +3316,9 @@
         </w:tc>
       </w:tr>
       <w:tr>
-        <w:trPr/>
+        <w:trPr>
+          <w:cantSplit/>
+        </w:trPr>
         <w:tc>
           <w:tcPr>
             <w:tcW w:type="dxa" w:w="2088"/>
@@ -3985,7 +3426,9 @@
         </w:tc>
       </w:tr>
       <w:tr>
-        <w:trPr/>
+        <w:trPr>
+          <w:cantSplit/>
+        </w:trPr>
         <w:tc>
           <w:tcPr>
             <w:tcW w:type="dxa" w:w="2088"/>
@@ -4134,7 +3577,9 @@
         </w:tc>
       </w:tr>
       <w:tr>
-        <w:trPr/>
+        <w:trPr>
+          <w:cantSplit/>
+        </w:trPr>
         <w:tc>
           <w:tcPr>
             <w:tcW w:type="dxa" w:w="2088"/>
@@ -4267,7 +3712,9 @@
         </w:tc>
       </w:tr>
       <w:tr>
-        <w:trPr/>
+        <w:trPr>
+          <w:cantSplit/>
+        </w:trPr>
         <w:tc>
           <w:tcPr>
             <w:tcW w:type="dxa" w:w="2088"/>
@@ -4409,7 +3856,9 @@
         </w:tc>
       </w:tr>
       <w:tr>
-        <w:trPr/>
+        <w:trPr>
+          <w:cantSplit/>
+        </w:trPr>
         <w:tc>
           <w:tcPr>
             <w:tcW w:type="dxa" w:w="2088"/>
@@ -4490,7 +3939,9 @@
         </w:tc>
       </w:tr>
       <w:tr>
-        <w:trPr/>
+        <w:trPr>
+          <w:cantSplit/>
+        </w:trPr>
         <w:tc>
           <w:tcPr>
             <w:tcW w:type="dxa" w:w="2088"/>
@@ -4571,7 +4022,9 @@
         </w:tc>
       </w:tr>
       <w:tr>
-        <w:trPr/>
+        <w:trPr>
+          <w:cantSplit/>
+        </w:trPr>
         <w:tc>
           <w:tcPr>
             <w:tcW w:type="dxa" w:w="2088"/>
@@ -4652,7 +4105,9 @@
         </w:tc>
       </w:tr>
       <w:tr>
-        <w:trPr/>
+        <w:trPr>
+          <w:cantSplit/>
+        </w:trPr>
         <w:tc>
           <w:tcPr>
             <w:tcW w:type="dxa" w:w="2088"/>
@@ -4745,49 +4200,7 @@
           <w:b/>
           <w:bCs/>
         </w:rPr>
-        <w:t xml:space="preserve">Граница этого утверждения:</w:t>
-      </w:r>
-      <w:r>
-        <w:t xml:space="preserve"> </w:t>
-      </w:r>
-      <w:r>
-        <w:t xml:space="preserve">ноль обращений Resolve доказан для штатной M1-службы</w:t>
-      </w:r>
-      <w:r>
-        <w:t xml:space="preserve"> </w:t>
-      </w:r>
-      <w:r>
-        <w:rPr>
-          <w:rStyle w:val="VerbatimChar"/>
-        </w:rPr>
-        <w:t xml:space="preserve">calls_two_processes.py</w:t>
-      </w:r>
-      <w:r>
-        <w:t xml:space="preserve">. Старый GUI и старый пакетный скрипт подготовки ASR/R+A пока</w:t>
-      </w:r>
-      <w:r>
-        <w:t xml:space="preserve"> </w:t>
-      </w:r>
-      <w:r>
-        <w:t xml:space="preserve">задают</w:t>
-      </w:r>
-      <w:r>
-        <w:t xml:space="preserve"> </w:t>
-      </w:r>
-      <w:r>
-        <w:rPr>
-          <w:rStyle w:val="VerbatimChar"/>
-        </w:rPr>
-        <w:t xml:space="preserve">RESOLVE_LLM_PROVIDER=codex_cli</w:t>
-      </w:r>
-      <w:r>
-        <w:t xml:space="preserve">; использовать их на M1 запрещено, иначе расход</w:t>
-      </w:r>
-      <w:r>
-        <w:t xml:space="preserve"> </w:t>
-      </w:r>
-      <w:r>
-        <w:t xml:space="preserve">вернётся. До отдельной кодовой правки M1 запускает только путь из финальной инструкции.</w:t>
+        <w:t>Граница этого утверждения: в проверенном коде штатное значение Resolve остаётся off, поэтому обращений к модели нет. Режим selective уже реализован, но на M1 ещё не развёрнут и не разрешён для реальных звонков. Его качество, доля срабатываний, задержка и расход должны быть измерены на неизменных копиях уже сохранённых ASR-результатов.</w:t>
       </w:r>
     </w:p>
     <w:p>
@@ -4979,84 +4392,7 @@
           <w:b/>
           <w:bCs/>
         </w:rPr>
-        <w:t xml:space="preserve">Resolve не вызывает модель ни в одном режиме службы.</w:t>
-      </w:r>
-      <w:r>
-        <w:t xml:space="preserve"> </w:t>
-      </w:r>
-      <w:r>
-        <w:t xml:space="preserve">Раньше служебное окружение</w:t>
-      </w:r>
-      <w:r>
-        <w:t xml:space="preserve"> </w:t>
-      </w:r>
-      <w:r>
-        <w:t xml:space="preserve">безусловно включало</w:t>
-      </w:r>
-      <w:r>
-        <w:t xml:space="preserve"> </w:t>
-      </w:r>
-      <w:r>
-        <w:rPr>
-          <w:rStyle w:val="VerbatimChar"/>
-        </w:rPr>
-        <w:t xml:space="preserve">codex_cli</w:t>
-      </w:r>
-      <w:r>
-        <w:t xml:space="preserve"> </w:t>
-      </w:r>
-      <w:r>
-        <w:t xml:space="preserve">для Resolve, и на звонках с расхождением двух</w:t>
-      </w:r>
-      <w:r>
-        <w:t xml:space="preserve"> </w:t>
-      </w:r>
-      <w:r>
-        <w:t xml:space="preserve">распознаваний это давало</w:t>
-      </w:r>
-      <w:r>
-        <w:t xml:space="preserve"> </w:t>
-      </w:r>
-      <w:r>
-        <w:rPr>
-          <w:b/>
-          <w:bCs/>
-        </w:rPr>
-        <w:t xml:space="preserve">дополнительные обращения сверх Analyse</w:t>
-      </w:r>
-      <w:r>
-        <w:t xml:space="preserve"> </w:t>
-      </w:r>
-      <w:r>
-        <w:t xml:space="preserve">— по одному на</w:t>
-      </w:r>
-      <w:r>
-        <w:t xml:space="preserve"> </w:t>
-      </w:r>
-      <w:r>
-        <w:t xml:space="preserve">слияние каждой дорожки. Теперь их ровно 0. Это единственная часть экономии, которая</w:t>
-      </w:r>
-      <w:r>
-        <w:t xml:space="preserve"> </w:t>
-      </w:r>
-      <w:r>
-        <w:t xml:space="preserve">уменьшает расход на</w:t>
-      </w:r>
-      <w:r>
-        <w:t xml:space="preserve"> </w:t>
-      </w:r>
-      <w:r>
-        <w:rPr>
-          <w:b/>
-          <w:bCs/>
-        </w:rPr>
-        <w:t xml:space="preserve">отдельном</w:t>
-      </w:r>
-      <w:r>
-        <w:t xml:space="preserve"> </w:t>
-      </w:r>
-      <w:r>
-        <w:t xml:space="preserve">звонке, а не только на массе.</w:t>
+        <w:t>Resolve по умолчанию не вызывает модель. Раньше на спорном звонке модель могла вызываться отдельно для каждой дорожки. Теперь штатный режим даёт 0 обращений, а пока выключенный selective ограничен максимум одним обращением на весь звонок. Реальную экономию ещё надо измерить.</w:t>
       </w:r>
     </w:p>
     <w:p>
@@ -5421,19 +4757,7 @@
           <w:b/>
           <w:bCs/>
         </w:rPr>
-        <w:t xml:space="preserve">Качество выводов на реальных звонках не измерено.</w:t>
-      </w:r>
-      <w:r>
-        <w:t xml:space="preserve"> </w:t>
-      </w:r>
-      <w:r>
-        <w:t xml:space="preserve">Тесты зелёные — это только</w:t>
-      </w:r>
-      <w:r>
-        <w:t xml:space="preserve"> </w:t>
-      </w:r>
-      <w:r>
-        <w:t xml:space="preserve">формальная исправность.</w:t>
+        <w:t>Качество выводов на реальных звонках не измерено. Тесты зелёные — это только формальная исправность. Для selective Resolve 435 тестов и аудит Claude подтверждают защитный каркас, но не доказывают улучшение реального текста. Нужна слепая проверка 10 → 50 → 100 с нулём выдумок.</w:t>
       </w:r>
     </w:p>
     <w:p>
@@ -5675,6 +4999,7 @@
         <w:trPr>
           <w:tblHeader w:val="on"/>
           <w:tblHeader w:val="true"/>
+          <w:cantSplit/>
         </w:trPr>
         <w:tc>
           <w:tcPr>
@@ -5762,7 +5087,9 @@
         </w:tc>
       </w:tr>
       <w:tr>
-        <w:trPr/>
+        <w:trPr>
+          <w:cantSplit/>
+        </w:trPr>
         <w:tc>
           <w:tcPr>
             <w:tcW w:type="dxa" w:w="2088"/>
@@ -5887,7 +5214,9 @@
         </w:tc>
       </w:tr>
       <w:tr>
-        <w:trPr/>
+        <w:trPr>
+          <w:cantSplit/>
+        </w:trPr>
         <w:tc>
           <w:tcPr>
             <w:tcW w:type="dxa" w:w="2088"/>
@@ -5910,24 +5239,7 @@
                 <w:color w:val="222222"/>
                 <w:sz w:val="16"/>
               </w:rPr>
-              <w:t xml:space="preserve">Старый GUI и</w:t>
-            </w:r>
-            <w:r>
-              <w:rPr>
-                <w:rFonts w:ascii="Calibri" w:hAnsi="Calibri" w:eastAsia="Calibri"/>
-                <w:color w:val="222222"/>
-                <w:sz w:val="16"/>
-              </w:rPr>
-              <w:t xml:space="preserve"> </w:t>
-            </w:r>
-            <w:r>
-              <w:rPr>
-                <w:rStyle w:val="VerbatimChar"/>
-                <w:rFonts w:ascii="Calibri" w:hAnsi="Calibri" w:eastAsia="Calibri"/>
-                <w:color w:val="222222"/>
-                <w:sz w:val="16"/>
-              </w:rPr>
-              <w:t xml:space="preserve">build_mango_new_calls_asr_ra_batch.py</w:t>
+              <w:t>Старый GUI, старый пакетный скрипт и режим selective Resolve</w:t>
             </w:r>
           </w:p>
         </w:tc>
@@ -5979,13 +5291,15 @@
                 <w:color w:val="222222"/>
                 <w:sz w:val="16"/>
               </w:rPr>
-              <w:t xml:space="preserve">Эти пути пока включают модель в Resolve и обходят проверенный бюджет штатной M1-службы.</w:t>
+              <w:t>Старые пути не входят в проверенный контур M1. Новый selective не включается до слепой проверки 10 → 50 → 100, замера расхода и отдельного решения Дмитрия.</w:t>
             </w:r>
           </w:p>
         </w:tc>
       </w:tr>
       <w:tr>
-        <w:trPr/>
+        <w:trPr>
+          <w:cantSplit/>
+        </w:trPr>
         <w:tc>
           <w:tcPr>
             <w:tcW w:type="dxa" w:w="2088"/>
@@ -6066,7 +5380,9 @@
         </w:tc>
       </w:tr>
       <w:tr>
-        <w:trPr/>
+        <w:trPr>
+          <w:cantSplit/>
+        </w:trPr>
         <w:tc>
           <w:tcPr>
             <w:tcW w:type="dxa" w:w="2088"/>
@@ -6164,7 +5480,9 @@
         </w:tc>
       </w:tr>
       <w:tr>
-        <w:trPr/>
+        <w:trPr>
+          <w:cantSplit/>
+        </w:trPr>
         <w:tc>
           <w:tcPr>
             <w:tcW w:type="dxa" w:w="2088"/>
@@ -6295,7 +5613,9 @@
         </w:tc>
       </w:tr>
       <w:tr>
-        <w:trPr/>
+        <w:trPr>
+          <w:cantSplit/>
+        </w:trPr>
         <w:tc>
           <w:tcPr>
             <w:tcW w:type="dxa" w:w="2088"/>
@@ -6376,7 +5696,9 @@
         </w:tc>
       </w:tr>
       <w:tr>
-        <w:trPr/>
+        <w:trPr>
+          <w:cantSplit/>
+        </w:trPr>
         <w:tc>
           <w:tcPr>
             <w:tcW w:type="dxa" w:w="2088"/>
@@ -6482,7 +5804,9 @@
         </w:tc>
       </w:tr>
       <w:tr>
-        <w:trPr/>
+        <w:trPr>
+          <w:cantSplit/>
+        </w:trPr>
         <w:tc>
           <w:tcPr>
             <w:tcW w:type="dxa" w:w="2088"/>
@@ -6768,23 +6092,7 @@
         </w:numPr>
       </w:pPr>
       <w:r>
-        <w:t xml:space="preserve">Код —</w:t>
-      </w:r>
-      <w:r>
-        <w:t xml:space="preserve"> </w:t>
-      </w:r>
-      <w:r>
-        <w:rPr>
-          <w:b/>
-          <w:bCs/>
-        </w:rPr>
-        <w:t xml:space="preserve">GO</w:t>
-      </w:r>
-      <w:r>
-        <w:t xml:space="preserve"> </w:t>
-      </w:r>
-      <w:r>
-        <w:t xml:space="preserve">для передачи на M1 и офлайн-проверки. Блокирующих дефектов не найдено.</w:t>
+        <w:t>Код Quality v3 и дополнение Resolve D-122 (dea4a54b) — GO для передачи на M1 и офлайн-проверки. Блокирующих дефектов в коде не найдено.</w:t>
       </w:r>
     </w:p>
     <w:p>
@@ -6908,29 +6216,7 @@
         </w:numPr>
       </w:pPr>
       <w:r>
-        <w:t xml:space="preserve">Экономия существует как механизм и измерима в</w:t>
-      </w:r>
-      <w:r>
-        <w:t xml:space="preserve"> </w:t>
-      </w:r>
-      <w:r>
-        <w:rPr>
-          <w:b/>
-          <w:bCs/>
-        </w:rPr>
-        <w:t xml:space="preserve">числе обращений</w:t>
-      </w:r>
-      <w:r>
-        <w:t xml:space="preserve"> </w:t>
-      </w:r>
-      <w:r>
-        <w:t xml:space="preserve">к модели.</w:t>
-      </w:r>
-      <w:r>
-        <w:t xml:space="preserve"> </w:t>
-      </w:r>
-      <w:r>
-        <w:t xml:space="preserve">Обещать процент экономии токенов нельзя — провайдер их не сообщает.</w:t>
+        <w:t>Экономия существует как механизм и измерима в числе обращений к модели. Обещать процент экономии токенов нельзя — провайдер их не сообщает. Выборочное улучшение Resolve остаётся выключенным до отдельного A/B-пилота.</w:t>
       </w:r>
     </w:p>
     <w:bookmarkEnd w:id="19"/>

</xml_diff>